<commit_message>
Credit author as socragpt across README, CITATION and documents
</commit_message>
<xml_diff>
--- a/openai-hf-2026-report.docx
+++ b/openai-hf-2026-report.docx
@@ -60,7 +60,7 @@
           <w:sz w:val="16"/>
           <w:szCs w:val="16"/>
         </w:rPr>
-        <w:t xml:space="preserve">Version 1.0   ·   31 August 2026   ·   Author: Tyler Pearson   ·   Licence: CC BY-SA 4.0   ·   Compiled from public sources (Appendix G)</w:t>
+        <w:t xml:space="preserve">Version 1.0   ·   31 August 2026   ·   Author: socragpt   ·   Licence: CC BY-SA 4.0   ·   Compiled from public sources (Appendix G)</w:t>
       </w:r>
     </w:p>
     <w:p>
@@ -22935,7 +22935,7 @@
           <w:sz w:val="16"/>
           <w:szCs w:val="16"/>
         </w:rPr>
-        <w:t xml:space="preserve">Note: This is an independent case study compiled solely from public information. Ratings are the author's own, are indicative, and do not represent an audited assessment. The document is not affiliated with, authorised by, or endorsed by OpenAI or Hugging Face. © 2026 Tyler Pearson. Licensed under CC BY-SA 4.0.</w:t>
+        <w:t xml:space="preserve">Note: This is an independent case study compiled solely from public information. Ratings are the author's own, are indicative, and do not represent an audited assessment. The document is not affiliated with, authorised by, or endorsed by OpenAI or Hugging Face. © 2026 socragpt. Licensed under CC BY-SA 4.0.</w:t>
       </w:r>
     </w:p>
     <w:sectPr>

</xml_diff>

<commit_message>
Relicense to CC BY 4.0 (LICENSE, README, CITATION, documents)
</commit_message>
<xml_diff>
--- a/openai-hf-2026-report.docx
+++ b/openai-hf-2026-report.docx
@@ -60,7 +60,7 @@
           <w:sz w:val="16"/>
           <w:szCs w:val="16"/>
         </w:rPr>
-        <w:t xml:space="preserve">Version 1.0   ·   31 August 2026   ·   Author: socragpt   ·   Licence: CC BY-SA 4.0   ·   Compiled from public sources (Appendix G)</w:t>
+        <w:t xml:space="preserve">Version 1.0   ·   31 August 2026   ·   Author: socragpt   ·   Licence: CC BY 4.0   ·   Compiled from public sources (Appendix G)</w:t>
       </w:r>
     </w:p>
     <w:p>
@@ -22935,7 +22935,7 @@
           <w:sz w:val="16"/>
           <w:szCs w:val="16"/>
         </w:rPr>
-        <w:t xml:space="preserve">Note: This is an independent case study compiled solely from public information. Ratings are the author's own, are indicative, and do not represent an audited assessment. The document is not affiliated with, authorised by, or endorsed by OpenAI or Hugging Face. © 2026 socragpt. Licensed under CC BY-SA 4.0.</w:t>
+        <w:t xml:space="preserve">Note: This is an independent case study compiled solely from public information. Ratings are the author's own, are indicative, and do not represent an audited assessment. The document is not affiliated with, authorised by, or endorsed by OpenAI or Hugging Face. © 2026 socragpt. Licensed under CC BY 4.0.</w:t>
       </w:r>
     </w:p>
     <w:sectPr>
@@ -23006,7 +23006,7 @@
         <w:sz w:val="15"/>
         <w:szCs w:val="15"/>
       </w:rPr>
-      <w:t xml:space="preserve">Agentic-AI Containment RCSA — Case Study   ·   CC BY-SA 4.0   |   Page </w:t>
+      <w:t xml:space="preserve">Agentic-AI Containment RCSA — Case Study   ·   CC BY 4.0   |   Page </w:t>
     </w:r>
     <w:r>
       <w:rPr>
@@ -23058,7 +23058,7 @@
         <w:sz w:val="15"/>
         <w:szCs w:val="15"/>
       </w:rPr>
-      <w:t xml:space="preserve">Agentic-AI Containment RCSA — Case Study — Appendices   ·   CC BY-SA 4.0   |   Page </w:t>
+      <w:t xml:space="preserve">Agentic-AI Containment RCSA — Case Study — Appendices   ·   CC BY 4.0   |   Page </w:t>
     </w:r>
     <w:r>
       <w:rPr>

</xml_diff>